<commit_message>
Scrub account ID + default passwords (env-driven placeholders); generalize runtime scripts (portable, self-locating, per-OS venv, dynamic account/region); regenerate runbook+maintenance docs; add scrubbed BUILD-NOTES
</commit_message>
<xml_diff>
--- a/docs/PV-AgentCore-Maintenance.docx
+++ b/docs/PV-AgentCore-Maintenance.docx
@@ -1583,7 +1583,7 @@
           <w:sz w:val="18"/>
           <w:szCs w:val="18"/>
         </w:rPr>
-        <w:t xml:space="preserve">bash _invoke.sh reviewer 'PvReviewer#2026!'</w:t>
+        <w:t xml:space="preserve">bash _invoke.sh reviewer</w:t>
       </w:r>
       <w:r>
         <w:t xml:space="preserve"> and </w:t>
@@ -1595,7 +1595,7 @@
           <w:sz w:val="18"/>
           <w:szCs w:val="18"/>
         </w:rPr>
-        <w:t xml:space="preserve">bash _invoke.sh outsider 'PvOutsider#2026!'</w:t>
+        <w:t xml:space="preserve">bash _invoke.sh outsider $PV_OUTSIDER_PW</w:t>
       </w:r>
       <w:r>
         <w:t xml:space="preserve">.</w:t>

</xml_diff>